<commit_message>
Updated docs and adding repo architecture for all state managements
</commit_message>
<xml_diff>
--- a/f12_statefulwidget_lifecycle_methods.docx
+++ b/f12_statefulwidget_lifecycle_methods.docx
@@ -3118,7 +3118,21 @@
           <w:sz w:val="36"/>
           <w:szCs w:val="36"/>
         </w:rPr>
-        <w:t xml:space="preserve"> to check safety.</w:t>
+        <w:t xml:space="preserve"> to check safe</w:t>
+      </w:r>
+      <w:r>
+        <w:rPr>
+          <w:sz w:val="36"/>
+          <w:szCs w:val="36"/>
+        </w:rPr>
+        <w:t>l</w:t>
+      </w:r>
+      <w:r>
+        <w:rPr>
+          <w:sz w:val="36"/>
+          <w:szCs w:val="36"/>
+        </w:rPr>
+        <w:t>y.</w:t>
       </w:r>
     </w:p>
     <w:p>
@@ -3201,7 +3215,195 @@
           <w:sz w:val="36"/>
           <w:szCs w:val="36"/>
         </w:rPr>
-        <w:t xml:space="preserve">Note: </w:t>
+        <w:t xml:space="preserve"># Remember, </w:t>
+      </w:r>
+      <w:r>
+        <w:rPr>
+          <w:b/>
+          <w:bCs/>
+          <w:sz w:val="36"/>
+          <w:szCs w:val="36"/>
+        </w:rPr>
+        <w:t>setState()</w:t>
+      </w:r>
+      <w:r>
+        <w:rPr>
+          <w:sz w:val="36"/>
+          <w:szCs w:val="36"/>
+        </w:rPr>
+        <w:t xml:space="preserve"> call the </w:t>
+      </w:r>
+      <w:r>
+        <w:rPr>
+          <w:b/>
+          <w:bCs/>
+          <w:sz w:val="36"/>
+          <w:szCs w:val="36"/>
+        </w:rPr>
+        <w:t>build()</w:t>
+      </w:r>
+      <w:r>
+        <w:rPr>
+          <w:sz w:val="36"/>
+          <w:szCs w:val="36"/>
+        </w:rPr>
+        <w:t xml:space="preserve"> method and rebuilds the whole widget tree present in that </w:t>
+      </w:r>
+      <w:r>
+        <w:rPr>
+          <w:b/>
+          <w:bCs/>
+          <w:sz w:val="36"/>
+          <w:szCs w:val="36"/>
+        </w:rPr>
+        <w:t xml:space="preserve">build() </w:t>
+      </w:r>
+      <w:r>
+        <w:rPr>
+          <w:sz w:val="36"/>
+          <w:szCs w:val="36"/>
+        </w:rPr>
+        <w:lastRenderedPageBreak/>
+        <w:t xml:space="preserve">method. Useful only when we want to rebuild the whole widget tree in the </w:t>
+      </w:r>
+      <w:r>
+        <w:rPr>
+          <w:b/>
+          <w:bCs/>
+          <w:sz w:val="36"/>
+          <w:szCs w:val="36"/>
+        </w:rPr>
+        <w:t>build()</w:t>
+      </w:r>
+      <w:r>
+        <w:rPr>
+          <w:sz w:val="36"/>
+          <w:szCs w:val="36"/>
+        </w:rPr>
+        <w:t xml:space="preserve"> method like a </w:t>
+      </w:r>
+      <w:r>
+        <w:rPr>
+          <w:b/>
+          <w:bCs/>
+          <w:sz w:val="36"/>
+          <w:szCs w:val="36"/>
+        </w:rPr>
+        <w:t>BottomNavigationBar</w:t>
+      </w:r>
+      <w:r>
+        <w:rPr>
+          <w:sz w:val="36"/>
+          <w:szCs w:val="36"/>
+        </w:rPr>
+        <w:t xml:space="preserve"> widget (instead of using </w:t>
+      </w:r>
+      <w:r>
+        <w:rPr>
+          <w:b/>
+          <w:bCs/>
+          <w:sz w:val="36"/>
+          <w:szCs w:val="36"/>
+        </w:rPr>
+        <w:t>ValueNotifier</w:t>
+      </w:r>
+      <w:r>
+        <w:rPr>
+          <w:b/>
+          <w:bCs/>
+          <w:sz w:val="36"/>
+          <w:szCs w:val="36"/>
+        </w:rPr>
+        <w:t xml:space="preserve"> </w:t>
+      </w:r>
+      <w:r>
+        <w:rPr>
+          <w:sz w:val="36"/>
+          <w:szCs w:val="36"/>
+        </w:rPr>
+        <w:t>cause it will do the same thing)</w:t>
+      </w:r>
+    </w:p>
+    <w:p>
+      <w:pPr>
+        <w:jc w:val="both"/>
+        <w:rPr>
+          <w:sz w:val="36"/>
+          <w:szCs w:val="36"/>
+        </w:rPr>
+      </w:pPr>
+      <w:r>
+        <w:rPr>
+          <w:b/>
+          <w:bCs/>
+          <w:sz w:val="36"/>
+          <w:szCs w:val="36"/>
+        </w:rPr>
+        <w:t>N</w:t>
+      </w:r>
+      <w:r>
+        <w:rPr>
+          <w:b/>
+          <w:bCs/>
+          <w:sz w:val="36"/>
+          <w:szCs w:val="36"/>
+        </w:rPr>
+        <w:t>OTE</w:t>
+      </w:r>
+      <w:r>
+        <w:rPr>
+          <w:b/>
+          <w:bCs/>
+          <w:sz w:val="36"/>
+          <w:szCs w:val="36"/>
+        </w:rPr>
+        <w:t>:</w:t>
+      </w:r>
+      <w:r>
+        <w:rPr>
+          <w:sz w:val="36"/>
+          <w:szCs w:val="36"/>
+        </w:rPr>
+        <w:t xml:space="preserve"> </w:t>
+      </w:r>
+      <w:r>
+        <w:rPr>
+          <w:sz w:val="36"/>
+          <w:szCs w:val="36"/>
+        </w:rPr>
+        <w:t xml:space="preserve">In case of State hoisting or using </w:t>
+      </w:r>
+      <w:r>
+        <w:rPr>
+          <w:b/>
+          <w:bCs/>
+          <w:sz w:val="36"/>
+          <w:szCs w:val="36"/>
+        </w:rPr>
+        <w:t>VoidCallback</w:t>
+      </w:r>
+      <w:r>
+        <w:rPr>
+          <w:sz w:val="36"/>
+          <w:szCs w:val="36"/>
+        </w:rPr>
+        <w:t xml:space="preserve"> to call a </w:t>
+      </w:r>
+      <w:r>
+        <w:rPr>
+          <w:b/>
+          <w:bCs/>
+          <w:sz w:val="36"/>
+          <w:szCs w:val="36"/>
+        </w:rPr>
+        <w:t>setState()</w:t>
+      </w:r>
+      <w:r>
+        <w:rPr>
+          <w:sz w:val="36"/>
+          <w:szCs w:val="36"/>
+        </w:rPr>
+        <w:t xml:space="preserve"> of  a sub-widget in home screen. </w:t>
       </w:r>
       <w:r>
         <w:rPr>
@@ -3224,6 +3426,13 @@
           <w:sz w:val="36"/>
           <w:szCs w:val="36"/>
         </w:rPr>
+        <w:t xml:space="preserve"> </w:t>
+      </w:r>
+      <w:r>
+        <w:rPr>
+          <w:sz w:val="36"/>
+          <w:szCs w:val="36"/>
+        </w:rPr>
         <w:t xml:space="preserve">. </w:t>
       </w:r>
       <w:r>
@@ -3231,20 +3440,42 @@
           <w:sz w:val="36"/>
           <w:szCs w:val="36"/>
         </w:rPr>
-        <w:t xml:space="preserve">It only rebuilds the widget subtree below the State object where </w:t>
-      </w:r>
-      <w:r>
-        <w:rPr>
-          <w:b/>
-          <w:bCs/>
-          <w:sz w:val="36"/>
-          <w:szCs w:val="36"/>
-        </w:rPr>
-        <w:lastRenderedPageBreak/>
+        <w:t>It only rebuilds the widget subtree below the State object</w:t>
+      </w:r>
+      <w:r>
+        <w:rPr>
+          <w:sz w:val="36"/>
+          <w:szCs w:val="36"/>
+        </w:rPr>
+        <w:t xml:space="preserve"> class</w:t>
+      </w:r>
+      <w:r>
+        <w:rPr>
+          <w:sz w:val="36"/>
+          <w:szCs w:val="36"/>
+        </w:rPr>
+        <w:t xml:space="preserve"> where </w:t>
+      </w:r>
+      <w:r>
+        <w:rPr>
+          <w:b/>
+          <w:bCs/>
+          <w:sz w:val="36"/>
+          <w:szCs w:val="36"/>
+        </w:rPr>
         <w:t>setState</w:t>
       </w:r>
       <w:r>
         <w:rPr>
+          <w:b/>
+          <w:bCs/>
+          <w:sz w:val="36"/>
+          <w:szCs w:val="36"/>
+        </w:rPr>
+        <w:t>()</w:t>
+      </w:r>
+      <w:r>
+        <w:rPr>
           <w:sz w:val="36"/>
           <w:szCs w:val="36"/>
         </w:rPr>
@@ -3262,14 +3493,14 @@
           <w:sz w:val="36"/>
           <w:szCs w:val="36"/>
         </w:rPr>
-        <w:t xml:space="preserve"> Move state down if only the widget changes state should live inside that widget</w:t>
-      </w:r>
-      <w:r>
-        <w:rPr>
-          <w:sz w:val="36"/>
-          <w:szCs w:val="36"/>
-        </w:rPr>
-        <w:t xml:space="preserve">. If we need extra logic in home page then use </w:t>
+        <w:t xml:space="preserve"> </w:t>
+      </w:r>
+      <w:r>
+        <w:rPr>
+          <w:sz w:val="36"/>
+          <w:szCs w:val="36"/>
+        </w:rPr>
+        <w:t xml:space="preserve">If we need extra logic in home page then use </w:t>
       </w:r>
       <w:r>
         <w:rPr>
@@ -3326,7 +3557,25 @@
           <w:sz w:val="36"/>
           <w:szCs w:val="36"/>
         </w:rPr>
-        <w:t>seState</w:t>
+        <w:t>se</w:t>
+      </w:r>
+      <w:r>
+        <w:rPr>
+          <w:b/>
+          <w:bCs/>
+          <w:sz w:val="36"/>
+          <w:szCs w:val="36"/>
+        </w:rPr>
+        <w:t>t</w:t>
+      </w:r>
+      <w:r>
+        <w:rPr>
+          <w:b/>
+          <w:bCs/>
+          <w:sz w:val="36"/>
+          <w:szCs w:val="36"/>
+        </w:rPr>
+        <w:t>State</w:t>
       </w:r>
       <w:r>
         <w:rPr>
@@ -3367,6 +3616,17 @@
         </w:rPr>
         <w:t xml:space="preserve"> it will crash</w:t>
       </w:r>
+    </w:p>
+    <w:p>
+      <w:pPr>
+        <w:jc w:val="both"/>
+        <w:rPr>
+          <w:b/>
+          <w:bCs/>
+          <w:sz w:val="36"/>
+          <w:szCs w:val="36"/>
+        </w:rPr>
+      </w:pPr>
     </w:p>
     <w:p>
       <w:pPr>
@@ -3538,7 +3798,15 @@
           <w:sz w:val="36"/>
           <w:szCs w:val="36"/>
         </w:rPr>
-        <w:t xml:space="preserve"> open the app parent builds ToDoTile with taskCompleted = false.</w:t>
+        <w:t xml:space="preserve"> open the app parent builds </w:t>
+      </w:r>
+      <w:r>
+        <w:rPr>
+          <w:sz w:val="36"/>
+          <w:szCs w:val="36"/>
+        </w:rPr>
+        <w:lastRenderedPageBreak/>
+        <w:t>ToDoTile with taskCompleted = false.</w:t>
       </w:r>
       <w:r>
         <w:rPr>
@@ -3638,89 +3906,382 @@
           <w:sz w:val="36"/>
           <w:szCs w:val="36"/>
         </w:rPr>
-        <w:t xml:space="preserve">, our local completed would still be true </w:t>
-      </w:r>
-      <w:r>
-        <w:rPr>
+        <w:t>, our local completed would still be true (stale!). Bug: UI shows checked even though DB says unchecked.</w:t>
+      </w:r>
+    </w:p>
+    <w:p>
+      <w:pPr>
+        <w:jc w:val="both"/>
+        <w:rPr>
+          <w:sz w:val="36"/>
+          <w:szCs w:val="36"/>
+        </w:rPr>
+      </w:pPr>
+      <w:r>
+        <w:rPr>
+          <w:sz w:val="36"/>
+          <w:szCs w:val="36"/>
+        </w:rPr>
+        <w:t xml:space="preserve"># </w:t>
+      </w:r>
+      <w:r>
+        <w:rPr>
+          <w:b/>
+          <w:bCs/>
+          <w:sz w:val="36"/>
+          <w:szCs w:val="36"/>
+        </w:rPr>
+        <w:t>didUpdateWidget</w:t>
+      </w:r>
+      <w:r>
+        <w:rPr>
+          <w:sz w:val="36"/>
+          <w:szCs w:val="36"/>
+        </w:rPr>
+        <w:t xml:space="preserve"> solves this by listening for parent-provided changes and syncing our local copy.</w:t>
+      </w:r>
+    </w:p>
+    <w:p>
+      <w:pPr>
+        <w:jc w:val="both"/>
+        <w:rPr>
+          <w:sz w:val="36"/>
+          <w:szCs w:val="36"/>
+        </w:rPr>
+      </w:pPr>
+      <w:r>
+        <w:rPr>
+          <w:sz w:val="36"/>
+          <w:szCs w:val="36"/>
+        </w:rPr>
+        <w:t># It takes a parameter which is the oldwidget of ToDoTile.</w:t>
+      </w:r>
+    </w:p>
+    <w:p>
+      <w:pPr>
+        <w:jc w:val="both"/>
+        <w:rPr>
+          <w:sz w:val="36"/>
+          <w:szCs w:val="36"/>
+        </w:rPr>
+      </w:pPr>
+      <w:r>
+        <w:rPr>
+          <w:sz w:val="36"/>
+          <w:szCs w:val="36"/>
+        </w:rPr>
+        <w:t xml:space="preserve"># </w:t>
+      </w:r>
+      <w:r>
+        <w:rPr>
+          <w:sz w:val="36"/>
+          <w:szCs w:val="36"/>
+        </w:rPr>
+        <w:t>oldWidget → the previous configuration (before rebuild).</w:t>
+      </w:r>
+      <w:r>
+        <w:rPr>
+          <w:sz w:val="36"/>
+          <w:szCs w:val="36"/>
+        </w:rPr>
+        <w:t xml:space="preserve"> </w:t>
+      </w:r>
+      <w:r>
+        <w:rPr>
+          <w:sz w:val="36"/>
+          <w:szCs w:val="36"/>
+        </w:rPr>
+        <w:t>widget → the new configuration (after rebuild).</w:t>
+      </w:r>
+      <w:r>
+        <w:rPr>
+          <w:sz w:val="36"/>
+          <w:szCs w:val="36"/>
+        </w:rPr>
+        <w:t xml:space="preserve"> We</w:t>
+      </w:r>
+      <w:r>
+        <w:rPr>
+          <w:sz w:val="36"/>
+          <w:szCs w:val="36"/>
+        </w:rPr>
+        <w:t xml:space="preserve"> compare them:</w:t>
+      </w:r>
+      <w:r>
+        <w:rPr>
+          <w:sz w:val="36"/>
+          <w:szCs w:val="36"/>
+        </w:rPr>
+        <w:t xml:space="preserve"> </w:t>
+      </w:r>
+      <w:r>
+        <w:rPr>
+          <w:sz w:val="36"/>
+          <w:szCs w:val="36"/>
+        </w:rPr>
+        <w:t xml:space="preserve">If the parent changed </w:t>
+      </w:r>
+      <w:r>
+        <w:rPr>
+          <w:b/>
+          <w:bCs/>
+          <w:sz w:val="36"/>
+          <w:szCs w:val="36"/>
+        </w:rPr>
+        <w:t>taskCompleted</w:t>
+      </w:r>
+      <w:r>
+        <w:rPr>
+          <w:sz w:val="36"/>
+          <w:szCs w:val="36"/>
+        </w:rPr>
+        <w:t xml:space="preserve">, </w:t>
+      </w:r>
+      <w:r>
+        <w:rPr>
+          <w:sz w:val="36"/>
+          <w:szCs w:val="36"/>
+        </w:rPr>
+        <w:t>we</w:t>
+      </w:r>
+      <w:r>
+        <w:rPr>
+          <w:sz w:val="36"/>
+          <w:szCs w:val="36"/>
+        </w:rPr>
+        <w:t xml:space="preserve"> update our local completed variable.</w:t>
+      </w:r>
+      <w:r>
+        <w:rPr>
+          <w:sz w:val="36"/>
+          <w:szCs w:val="36"/>
+        </w:rPr>
+        <w:t xml:space="preserve"> T</w:t>
+      </w:r>
+      <w:r>
+        <w:rPr>
+          <w:sz w:val="36"/>
+          <w:szCs w:val="36"/>
+        </w:rPr>
+        <w:t>his ensures our local state stays in sync with the parent’s data</w:t>
+      </w:r>
+      <w:r>
+        <w:rPr>
+          <w:sz w:val="36"/>
+          <w:szCs w:val="36"/>
+        </w:rPr>
+        <w:t>.</w:t>
+      </w:r>
+    </w:p>
+    <w:p>
+      <w:pPr>
+        <w:jc w:val="both"/>
+        <w:rPr>
+          <w:b/>
+          <w:bCs/>
+          <w:color w:val="D86DCB" w:themeColor="accent5" w:themeTint="99"/>
+          <w:sz w:val="36"/>
+          <w:szCs w:val="36"/>
+        </w:rPr>
+      </w:pPr>
+      <w:r>
+        <w:rPr>
+          <w:b/>
+          <w:bCs/>
+          <w:color w:val="D86DCB" w:themeColor="accent5" w:themeTint="99"/>
+          <w:sz w:val="36"/>
+          <w:szCs w:val="36"/>
+        </w:rPr>
+        <w:t>@override</w:t>
+      </w:r>
+    </w:p>
+    <w:p>
+      <w:pPr>
+        <w:jc w:val="both"/>
+        <w:rPr>
+          <w:b/>
+          <w:bCs/>
+          <w:color w:val="D86DCB" w:themeColor="accent5" w:themeTint="99"/>
+          <w:sz w:val="36"/>
+          <w:szCs w:val="36"/>
+        </w:rPr>
+      </w:pPr>
+      <w:r>
+        <w:rPr>
+          <w:b/>
+          <w:bCs/>
+          <w:color w:val="D86DCB" w:themeColor="accent5" w:themeTint="99"/>
+          <w:sz w:val="36"/>
+          <w:szCs w:val="36"/>
+        </w:rPr>
+        <w:t>void didUpdateWidget(covariant ToDoTile oldWidget) {</w:t>
+      </w:r>
+    </w:p>
+    <w:p>
+      <w:pPr>
+        <w:jc w:val="both"/>
+        <w:rPr>
+          <w:b/>
+          <w:bCs/>
+          <w:color w:val="D86DCB" w:themeColor="accent5" w:themeTint="99"/>
+          <w:sz w:val="36"/>
+          <w:szCs w:val="36"/>
+        </w:rPr>
+      </w:pPr>
+      <w:r>
+        <w:rPr>
+          <w:b/>
+          <w:bCs/>
+          <w:color w:val="D86DCB" w:themeColor="accent5" w:themeTint="99"/>
+          <w:sz w:val="36"/>
+          <w:szCs w:val="36"/>
+        </w:rPr>
+        <w:t xml:space="preserve">  super.didUpdateWidget(oldWidget);</w:t>
+      </w:r>
+    </w:p>
+    <w:p>
+      <w:pPr>
+        <w:jc w:val="both"/>
+        <w:rPr>
+          <w:b/>
+          <w:bCs/>
+          <w:color w:val="D86DCB" w:themeColor="accent5" w:themeTint="99"/>
+          <w:sz w:val="36"/>
+          <w:szCs w:val="36"/>
+        </w:rPr>
+      </w:pPr>
+      <w:r>
+        <w:rPr>
+          <w:b/>
+          <w:bCs/>
+          <w:color w:val="D86DCB" w:themeColor="accent5" w:themeTint="99"/>
+          <w:sz w:val="36"/>
+          <w:szCs w:val="36"/>
+        </w:rPr>
+        <w:t xml:space="preserve">  // if parent changed the value, sync local state</w:t>
+      </w:r>
+    </w:p>
+    <w:p>
+      <w:pPr>
+        <w:jc w:val="both"/>
+        <w:rPr>
+          <w:b/>
+          <w:bCs/>
+          <w:color w:val="D86DCB" w:themeColor="accent5" w:themeTint="99"/>
+          <w:sz w:val="36"/>
+          <w:szCs w:val="36"/>
+        </w:rPr>
+      </w:pPr>
+      <w:r>
+        <w:rPr>
+          <w:b/>
+          <w:bCs/>
+          <w:color w:val="D86DCB" w:themeColor="accent5" w:themeTint="99"/>
+          <w:sz w:val="36"/>
+          <w:szCs w:val="36"/>
+        </w:rPr>
+        <w:t xml:space="preserve">  if (oldWidget.taskCompleted != widget.taskCompleted) {</w:t>
+      </w:r>
+    </w:p>
+    <w:p>
+      <w:pPr>
+        <w:jc w:val="both"/>
+        <w:rPr>
+          <w:b/>
+          <w:bCs/>
+          <w:color w:val="D86DCB" w:themeColor="accent5" w:themeTint="99"/>
+          <w:sz w:val="36"/>
+          <w:szCs w:val="36"/>
+        </w:rPr>
+      </w:pPr>
+      <w:r>
+        <w:rPr>
+          <w:b/>
+          <w:bCs/>
+          <w:color w:val="D86DCB" w:themeColor="accent5" w:themeTint="99"/>
+          <w:sz w:val="36"/>
+          <w:szCs w:val="36"/>
+        </w:rPr>
+        <w:t xml:space="preserve">    setState(() =&gt; completed = widget.taskCompleted);</w:t>
+      </w:r>
+    </w:p>
+    <w:p>
+      <w:pPr>
+        <w:jc w:val="both"/>
+        <w:rPr>
+          <w:b/>
+          <w:bCs/>
+          <w:color w:val="D86DCB" w:themeColor="accent5" w:themeTint="99"/>
+          <w:sz w:val="36"/>
+          <w:szCs w:val="36"/>
+        </w:rPr>
+      </w:pPr>
+      <w:r>
+        <w:rPr>
+          <w:b/>
+          <w:bCs/>
+          <w:color w:val="D86DCB" w:themeColor="accent5" w:themeTint="99"/>
           <w:sz w:val="36"/>
           <w:szCs w:val="36"/>
         </w:rPr>
         <w:lastRenderedPageBreak/>
-        <w:t>(stale!). Bug: UI shows checked even though DB says unchecked.</w:t>
-      </w:r>
-    </w:p>
-    <w:p>
-      <w:pPr>
-        <w:jc w:val="both"/>
-        <w:rPr>
-          <w:sz w:val="36"/>
-          <w:szCs w:val="36"/>
-        </w:rPr>
-      </w:pPr>
-      <w:r>
-        <w:rPr>
-          <w:sz w:val="36"/>
-          <w:szCs w:val="36"/>
-        </w:rPr>
-        <w:t xml:space="preserve"># </w:t>
-      </w:r>
-      <w:r>
-        <w:rPr>
-          <w:b/>
-          <w:bCs/>
-          <w:sz w:val="36"/>
-          <w:szCs w:val="36"/>
-        </w:rPr>
-        <w:t>didUpdateWidget</w:t>
-      </w:r>
-      <w:r>
-        <w:rPr>
-          <w:sz w:val="36"/>
-          <w:szCs w:val="36"/>
-        </w:rPr>
-        <w:t xml:space="preserve"> solves this by listening for parent-provided changes and syncing our local copy.</w:t>
-      </w:r>
-    </w:p>
-    <w:p>
-      <w:pPr>
-        <w:jc w:val="both"/>
-        <w:rPr>
-          <w:sz w:val="36"/>
-          <w:szCs w:val="36"/>
-        </w:rPr>
-      </w:pPr>
-      <w:r>
-        <w:rPr>
-          <w:sz w:val="36"/>
-          <w:szCs w:val="36"/>
-        </w:rPr>
-        <w:t># It takes a parameter which is the oldwidget of ToDoTile.</w:t>
-      </w:r>
-    </w:p>
-    <w:p>
-      <w:pPr>
-        <w:jc w:val="both"/>
-        <w:rPr>
-          <w:sz w:val="36"/>
-          <w:szCs w:val="36"/>
-        </w:rPr>
-      </w:pPr>
-      <w:r>
-        <w:rPr>
-          <w:sz w:val="36"/>
-          <w:szCs w:val="36"/>
-        </w:rPr>
-        <w:t xml:space="preserve"># </w:t>
-      </w:r>
-      <w:r>
-        <w:rPr>
-          <w:sz w:val="36"/>
-          <w:szCs w:val="36"/>
-        </w:rPr>
-        <w:t>oldWidget → the previous configuration (before rebuild).</w:t>
-      </w:r>
-      <w:r>
-        <w:rPr>
+        <w:t xml:space="preserve">  }</w:t>
+      </w:r>
+    </w:p>
+    <w:p>
+      <w:pPr>
+        <w:jc w:val="both"/>
+        <w:rPr>
+          <w:b/>
+          <w:bCs/>
+          <w:color w:val="D86DCB" w:themeColor="accent5" w:themeTint="99"/>
+          <w:sz w:val="36"/>
+          <w:szCs w:val="36"/>
+        </w:rPr>
+      </w:pPr>
+      <w:r>
+        <w:rPr>
+          <w:b/>
+          <w:bCs/>
+          <w:color w:val="D86DCB" w:themeColor="accent5" w:themeTint="99"/>
+          <w:sz w:val="36"/>
+          <w:szCs w:val="36"/>
+        </w:rPr>
+        <w:t>}</w:t>
+      </w:r>
+    </w:p>
+    <w:p>
+      <w:pPr>
+        <w:jc w:val="both"/>
+        <w:rPr>
+          <w:sz w:val="36"/>
+          <w:szCs w:val="36"/>
+        </w:rPr>
+      </w:pPr>
+    </w:p>
+    <w:p>
+      <w:pPr>
+        <w:jc w:val="both"/>
+        <w:rPr>
+          <w:b/>
+          <w:bCs/>
+          <w:sz w:val="36"/>
+          <w:szCs w:val="36"/>
+        </w:rPr>
+      </w:pPr>
+      <w:r>
+        <w:rPr>
+          <w:b/>
+          <w:bCs/>
+          <w:sz w:val="36"/>
+          <w:szCs w:val="36"/>
+        </w:rPr>
+        <w:t>deactivate()</w:t>
+      </w:r>
+      <w:r>
+        <w:rPr>
+          <w:b/>
+          <w:bCs/>
           <w:sz w:val="36"/>
           <w:szCs w:val="36"/>
         </w:rPr>
@@ -3731,21 +4292,46 @@
           <w:sz w:val="36"/>
           <w:szCs w:val="36"/>
         </w:rPr>
-        <w:t>widget → the new configuration (after rebuild).</w:t>
-      </w:r>
-      <w:r>
-        <w:rPr>
-          <w:sz w:val="36"/>
-          <w:szCs w:val="36"/>
-        </w:rPr>
-        <w:t xml:space="preserve"> We</w:t>
-      </w:r>
-      <w:r>
-        <w:rPr>
-          <w:sz w:val="36"/>
-          <w:szCs w:val="36"/>
-        </w:rPr>
-        <w:t xml:space="preserve"> compare them:</w:t>
+        <w:t>(Rarely Used)</w:t>
+      </w:r>
+      <w:r>
+        <w:rPr>
+          <w:b/>
+          <w:bCs/>
+          <w:sz w:val="36"/>
+          <w:szCs w:val="36"/>
+        </w:rPr>
+        <w:t>:</w:t>
+      </w:r>
+    </w:p>
+    <w:p>
+      <w:pPr>
+        <w:jc w:val="both"/>
+        <w:rPr>
+          <w:sz w:val="36"/>
+          <w:szCs w:val="36"/>
+        </w:rPr>
+      </w:pPr>
+      <w:r>
+        <w:rPr>
+          <w:sz w:val="36"/>
+          <w:szCs w:val="36"/>
+        </w:rPr>
+        <w:t># It’s c</w:t>
+      </w:r>
+      <w:r>
+        <w:rPr>
+          <w:sz w:val="36"/>
+          <w:szCs w:val="36"/>
+        </w:rPr>
+        <w:t>alled when the widget is removed from the widget tree temporarily.</w:t>
+      </w:r>
+      <w:r>
+        <w:rPr>
+          <w:sz w:val="36"/>
+          <w:szCs w:val="36"/>
+        </w:rPr>
+        <w:t xml:space="preserve"> Like</w:t>
       </w:r>
       <w:r>
         <w:rPr>
@@ -3759,16 +4345,215 @@
           <w:sz w:val="36"/>
           <w:szCs w:val="36"/>
         </w:rPr>
-        <w:t xml:space="preserve">If the parent changed </w:t>
-      </w:r>
-      <w:r>
-        <w:rPr>
-          <w:b/>
-          <w:bCs/>
-          <w:sz w:val="36"/>
-          <w:szCs w:val="36"/>
-        </w:rPr>
-        <w:t>taskCompleted</w:t>
+        <w:t>n</w:t>
+      </w:r>
+      <w:r>
+        <w:rPr>
+          <w:sz w:val="36"/>
+          <w:szCs w:val="36"/>
+        </w:rPr>
+        <w:t>avigating to another page but might come back.</w:t>
+      </w:r>
+    </w:p>
+    <w:p>
+      <w:pPr>
+        <w:jc w:val="both"/>
+        <w:rPr>
+          <w:b/>
+          <w:bCs/>
+          <w:color w:val="D86DCB" w:themeColor="accent5" w:themeTint="99"/>
+          <w:sz w:val="36"/>
+          <w:szCs w:val="36"/>
+        </w:rPr>
+      </w:pPr>
+      <w:r>
+        <w:rPr>
+          <w:b/>
+          <w:bCs/>
+          <w:color w:val="D86DCB" w:themeColor="accent5" w:themeTint="99"/>
+          <w:sz w:val="36"/>
+          <w:szCs w:val="36"/>
+        </w:rPr>
+        <w:t>@override</w:t>
+      </w:r>
+    </w:p>
+    <w:p>
+      <w:pPr>
+        <w:jc w:val="both"/>
+        <w:rPr>
+          <w:b/>
+          <w:bCs/>
+          <w:color w:val="D86DCB" w:themeColor="accent5" w:themeTint="99"/>
+          <w:sz w:val="36"/>
+          <w:szCs w:val="36"/>
+        </w:rPr>
+      </w:pPr>
+      <w:r>
+        <w:rPr>
+          <w:b/>
+          <w:bCs/>
+          <w:color w:val="D86DCB" w:themeColor="accent5" w:themeTint="99"/>
+          <w:sz w:val="36"/>
+          <w:szCs w:val="36"/>
+        </w:rPr>
+        <w:t>void deactivate() {</w:t>
+      </w:r>
+    </w:p>
+    <w:p>
+      <w:pPr>
+        <w:jc w:val="both"/>
+        <w:rPr>
+          <w:b/>
+          <w:bCs/>
+          <w:color w:val="D86DCB" w:themeColor="accent5" w:themeTint="99"/>
+          <w:sz w:val="36"/>
+          <w:szCs w:val="36"/>
+        </w:rPr>
+      </w:pPr>
+      <w:r>
+        <w:rPr>
+          <w:b/>
+          <w:bCs/>
+          <w:color w:val="D86DCB" w:themeColor="accent5" w:themeTint="99"/>
+          <w:sz w:val="36"/>
+          <w:szCs w:val="36"/>
+        </w:rPr>
+        <w:t xml:space="preserve">  super.deactivate();</w:t>
+      </w:r>
+    </w:p>
+    <w:p>
+      <w:pPr>
+        <w:jc w:val="both"/>
+        <w:rPr>
+          <w:b/>
+          <w:bCs/>
+          <w:color w:val="D86DCB" w:themeColor="accent5" w:themeTint="99"/>
+          <w:sz w:val="36"/>
+          <w:szCs w:val="36"/>
+        </w:rPr>
+      </w:pPr>
+      <w:r>
+        <w:rPr>
+          <w:b/>
+          <w:bCs/>
+          <w:color w:val="D86DCB" w:themeColor="accent5" w:themeTint="99"/>
+          <w:sz w:val="36"/>
+          <w:szCs w:val="36"/>
+        </w:rPr>
+        <w:t xml:space="preserve">  print('Widget temporarily removed');</w:t>
+      </w:r>
+    </w:p>
+    <w:p>
+      <w:pPr>
+        <w:jc w:val="both"/>
+        <w:rPr>
+          <w:b/>
+          <w:bCs/>
+          <w:color w:val="D86DCB" w:themeColor="accent5" w:themeTint="99"/>
+          <w:sz w:val="36"/>
+          <w:szCs w:val="36"/>
+        </w:rPr>
+      </w:pPr>
+      <w:r>
+        <w:rPr>
+          <w:b/>
+          <w:bCs/>
+          <w:color w:val="D86DCB" w:themeColor="accent5" w:themeTint="99"/>
+          <w:sz w:val="36"/>
+          <w:szCs w:val="36"/>
+        </w:rPr>
+        <w:t>}</w:t>
+      </w:r>
+    </w:p>
+    <w:p>
+      <w:pPr>
+        <w:jc w:val="both"/>
+        <w:rPr>
+          <w:sz w:val="36"/>
+          <w:szCs w:val="36"/>
+        </w:rPr>
+      </w:pPr>
+    </w:p>
+    <w:p>
+      <w:pPr>
+        <w:jc w:val="both"/>
+        <w:rPr>
+          <w:b/>
+          <w:bCs/>
+          <w:sz w:val="36"/>
+          <w:szCs w:val="36"/>
+        </w:rPr>
+      </w:pPr>
+      <w:r>
+        <w:rPr>
+          <w:b/>
+          <w:bCs/>
+          <w:sz w:val="36"/>
+          <w:szCs w:val="36"/>
+        </w:rPr>
+        <w:t>dispose()</w:t>
+      </w:r>
+      <w:r>
+        <w:rPr>
+          <w:b/>
+          <w:bCs/>
+          <w:sz w:val="36"/>
+          <w:szCs w:val="36"/>
+        </w:rPr>
+        <w:t>:</w:t>
+      </w:r>
+    </w:p>
+    <w:p>
+      <w:pPr>
+        <w:jc w:val="both"/>
+        <w:rPr>
+          <w:sz w:val="36"/>
+          <w:szCs w:val="36"/>
+        </w:rPr>
+      </w:pPr>
+      <w:r>
+        <w:rPr>
+          <w:sz w:val="36"/>
+          <w:szCs w:val="36"/>
+        </w:rPr>
+        <w:t># It’s c</w:t>
+      </w:r>
+      <w:r>
+        <w:rPr>
+          <w:sz w:val="36"/>
+          <w:szCs w:val="36"/>
+        </w:rPr>
+        <w:t>alled when the widget is permanently removed (destroyed).</w:t>
+      </w:r>
+      <w:r>
+        <w:rPr>
+          <w:sz w:val="36"/>
+          <w:szCs w:val="36"/>
+        </w:rPr>
+        <w:t xml:space="preserve"> </w:t>
+      </w:r>
+      <w:r>
+        <w:rPr>
+          <w:sz w:val="36"/>
+          <w:szCs w:val="36"/>
+        </w:rPr>
+        <w:t xml:space="preserve">Perfect for cleaning up resources </w:t>
+      </w:r>
+      <w:r>
+        <w:rPr>
+          <w:sz w:val="36"/>
+          <w:szCs w:val="36"/>
+        </w:rPr>
+        <w:t xml:space="preserve">like </w:t>
+      </w:r>
+      <w:r>
+        <w:rPr>
+          <w:b/>
+          <w:bCs/>
+          <w:sz w:val="36"/>
+          <w:szCs w:val="36"/>
+        </w:rPr>
+        <w:t>controllers</w:t>
       </w:r>
       <w:r>
         <w:rPr>
@@ -3779,31 +4564,49 @@
       </w:r>
       <w:r>
         <w:rPr>
-          <w:sz w:val="36"/>
-          <w:szCs w:val="36"/>
-        </w:rPr>
-        <w:t>we</w:t>
-      </w:r>
-      <w:r>
-        <w:rPr>
-          <w:sz w:val="36"/>
-          <w:szCs w:val="36"/>
-        </w:rPr>
-        <w:t xml:space="preserve"> update our local completed variable.</w:t>
-      </w:r>
-      <w:r>
-        <w:rPr>
-          <w:sz w:val="36"/>
-          <w:szCs w:val="36"/>
-        </w:rPr>
-        <w:t xml:space="preserve"> T</w:t>
-      </w:r>
-      <w:r>
-        <w:rPr>
-          <w:sz w:val="36"/>
-          <w:szCs w:val="36"/>
-        </w:rPr>
-        <w:t>his ensures our local state stays in sync with the parent’s data</w:t>
+          <w:b/>
+          <w:bCs/>
+          <w:sz w:val="36"/>
+          <w:szCs w:val="36"/>
+        </w:rPr>
+        <w:t>streams</w:t>
+      </w:r>
+      <w:r>
+        <w:rPr>
+          <w:sz w:val="36"/>
+          <w:szCs w:val="36"/>
+        </w:rPr>
+        <w:t xml:space="preserve">, </w:t>
+      </w:r>
+      <w:r>
+        <w:rPr>
+          <w:b/>
+          <w:bCs/>
+          <w:sz w:val="36"/>
+          <w:szCs w:val="36"/>
+        </w:rPr>
+        <w:t>focus nodes</w:t>
+      </w:r>
+      <w:r>
+        <w:rPr>
+          <w:sz w:val="36"/>
+          <w:szCs w:val="36"/>
+        </w:rPr>
+        <w:t>, etc.</w:t>
+      </w:r>
+      <w:r>
+        <w:rPr>
+          <w:sz w:val="36"/>
+          <w:szCs w:val="36"/>
+        </w:rPr>
+        <w:t xml:space="preserve"> </w:t>
+      </w:r>
+      <w:r>
+        <w:rPr>
+          <w:sz w:val="36"/>
+          <w:szCs w:val="36"/>
+        </w:rPr>
+        <w:t>It is used to clean up the controller when the widget is disposed. This is important to prevent memory leaks</w:t>
       </w:r>
       <w:r>
         <w:rPr>
@@ -3854,117 +4657,74 @@
           <w:sz w:val="36"/>
           <w:szCs w:val="36"/>
         </w:rPr>
-        <w:t>void didUpdateWidget(covariant ToDoTile oldWidget) {</w:t>
-      </w:r>
-    </w:p>
-    <w:p>
-      <w:pPr>
-        <w:jc w:val="both"/>
-        <w:rPr>
-          <w:b/>
-          <w:bCs/>
-          <w:color w:val="D86DCB" w:themeColor="accent5" w:themeTint="99"/>
-          <w:sz w:val="36"/>
-          <w:szCs w:val="36"/>
-        </w:rPr>
-      </w:pPr>
-      <w:r>
-        <w:rPr>
-          <w:b/>
-          <w:bCs/>
-          <w:color w:val="D86DCB" w:themeColor="accent5" w:themeTint="99"/>
-          <w:sz w:val="36"/>
-          <w:szCs w:val="36"/>
-        </w:rPr>
-        <w:t xml:space="preserve">  super.didUpdateWidget(oldWidget);</w:t>
-      </w:r>
-    </w:p>
-    <w:p>
-      <w:pPr>
-        <w:jc w:val="both"/>
-        <w:rPr>
-          <w:b/>
-          <w:bCs/>
-          <w:color w:val="D86DCB" w:themeColor="accent5" w:themeTint="99"/>
-          <w:sz w:val="36"/>
-          <w:szCs w:val="36"/>
-        </w:rPr>
-      </w:pPr>
-      <w:r>
-        <w:rPr>
-          <w:b/>
-          <w:bCs/>
-          <w:color w:val="D86DCB" w:themeColor="accent5" w:themeTint="99"/>
-          <w:sz w:val="36"/>
-          <w:szCs w:val="36"/>
-        </w:rPr>
-        <w:t xml:space="preserve">  // if parent changed the value, sync local state</w:t>
-      </w:r>
-    </w:p>
-    <w:p>
-      <w:pPr>
-        <w:jc w:val="both"/>
-        <w:rPr>
-          <w:b/>
-          <w:bCs/>
-          <w:color w:val="D86DCB" w:themeColor="accent5" w:themeTint="99"/>
-          <w:sz w:val="36"/>
-          <w:szCs w:val="36"/>
-        </w:rPr>
-      </w:pPr>
-      <w:r>
-        <w:rPr>
-          <w:b/>
-          <w:bCs/>
-          <w:color w:val="D86DCB" w:themeColor="accent5" w:themeTint="99"/>
-          <w:sz w:val="36"/>
-          <w:szCs w:val="36"/>
-        </w:rPr>
-        <w:t xml:space="preserve">  if (oldWidget.taskCompleted != widget.taskCompleted) {</w:t>
-      </w:r>
-    </w:p>
-    <w:p>
-      <w:pPr>
-        <w:jc w:val="both"/>
-        <w:rPr>
-          <w:b/>
-          <w:bCs/>
-          <w:color w:val="D86DCB" w:themeColor="accent5" w:themeTint="99"/>
-          <w:sz w:val="36"/>
-          <w:szCs w:val="36"/>
-        </w:rPr>
-      </w:pPr>
-      <w:r>
-        <w:rPr>
-          <w:b/>
-          <w:bCs/>
-          <w:color w:val="D86DCB" w:themeColor="accent5" w:themeTint="99"/>
-          <w:sz w:val="36"/>
-          <w:szCs w:val="36"/>
-        </w:rPr>
-        <w:t xml:space="preserve">    setState(() =&gt; completed = widget.taskCompleted);</w:t>
-      </w:r>
-    </w:p>
-    <w:p>
-      <w:pPr>
-        <w:jc w:val="both"/>
-        <w:rPr>
-          <w:b/>
-          <w:bCs/>
-          <w:color w:val="D86DCB" w:themeColor="accent5" w:themeTint="99"/>
-          <w:sz w:val="36"/>
-          <w:szCs w:val="36"/>
-        </w:rPr>
-      </w:pPr>
-      <w:r>
-        <w:rPr>
-          <w:b/>
-          <w:bCs/>
-          <w:color w:val="D86DCB" w:themeColor="accent5" w:themeTint="99"/>
-          <w:sz w:val="36"/>
-          <w:szCs w:val="36"/>
-        </w:rPr>
-        <w:t xml:space="preserve">  }</w:t>
+        <w:t>void dispose() {</w:t>
+      </w:r>
+    </w:p>
+    <w:p>
+      <w:pPr>
+        <w:jc w:val="both"/>
+        <w:rPr>
+          <w:b/>
+          <w:bCs/>
+          <w:color w:val="D86DCB" w:themeColor="accent5" w:themeTint="99"/>
+          <w:sz w:val="36"/>
+          <w:szCs w:val="36"/>
+        </w:rPr>
+      </w:pPr>
+      <w:r>
+        <w:rPr>
+          <w:b/>
+          <w:bCs/>
+          <w:color w:val="D86DCB" w:themeColor="accent5" w:themeTint="99"/>
+          <w:sz w:val="36"/>
+          <w:szCs w:val="36"/>
+        </w:rPr>
+        <w:t xml:space="preserve">  myController.dispose(); // prevents memory leak</w:t>
+      </w:r>
+    </w:p>
+    <w:p>
+      <w:pPr>
+        <w:jc w:val="both"/>
+        <w:rPr>
+          <w:b/>
+          <w:bCs/>
+          <w:color w:val="D86DCB" w:themeColor="accent5" w:themeTint="99"/>
+          <w:sz w:val="36"/>
+          <w:szCs w:val="36"/>
+        </w:rPr>
+      </w:pPr>
+      <w:r>
+        <w:rPr>
+          <w:b/>
+          <w:bCs/>
+          <w:color w:val="D86DCB" w:themeColor="accent5" w:themeTint="99"/>
+          <w:sz w:val="36"/>
+          <w:szCs w:val="36"/>
+        </w:rPr>
+        <w:lastRenderedPageBreak/>
+        <w:t xml:space="preserve">  myAnimationController.dispose();</w:t>
+      </w:r>
+    </w:p>
+    <w:p>
+      <w:pPr>
+        <w:jc w:val="both"/>
+        <w:rPr>
+          <w:b/>
+          <w:bCs/>
+          <w:color w:val="D86DCB" w:themeColor="accent5" w:themeTint="99"/>
+          <w:sz w:val="36"/>
+          <w:szCs w:val="36"/>
+        </w:rPr>
+      </w:pPr>
+      <w:r>
+        <w:rPr>
+          <w:b/>
+          <w:bCs/>
+          <w:color w:val="D86DCB" w:themeColor="accent5" w:themeTint="99"/>
+          <w:sz w:val="36"/>
+          <w:szCs w:val="36"/>
+        </w:rPr>
+        <w:t xml:space="preserve">  super.dispose();</w:t>
       </w:r>
     </w:p>
     <w:p>
@@ -3997,30 +4757,58 @@
           <w:szCs w:val="36"/>
         </w:rPr>
       </w:pPr>
-    </w:p>
-    <w:p>
-      <w:pPr>
-        <w:jc w:val="both"/>
-        <w:rPr>
-          <w:b/>
-          <w:bCs/>
-          <w:sz w:val="36"/>
-          <w:szCs w:val="36"/>
-        </w:rPr>
-      </w:pPr>
-      <w:r>
-        <w:rPr>
-          <w:b/>
-          <w:bCs/>
-          <w:sz w:val="36"/>
-          <w:szCs w:val="36"/>
-        </w:rPr>
-        <w:t>deactivate()</w:t>
-      </w:r>
-      <w:r>
-        <w:rPr>
-          <w:b/>
-          <w:bCs/>
+      <w:r>
+        <w:rPr>
+          <w:b/>
+          <w:bCs/>
+          <w:sz w:val="36"/>
+          <w:szCs w:val="36"/>
+        </w:rPr>
+        <w:t>N</w:t>
+      </w:r>
+      <w:r>
+        <w:rPr>
+          <w:b/>
+          <w:bCs/>
+          <w:sz w:val="36"/>
+          <w:szCs w:val="36"/>
+        </w:rPr>
+        <w:t>OTE</w:t>
+      </w:r>
+      <w:r>
+        <w:rPr>
+          <w:b/>
+          <w:bCs/>
+          <w:sz w:val="36"/>
+          <w:szCs w:val="36"/>
+        </w:rPr>
+        <w:t>:</w:t>
+      </w:r>
+      <w:r>
+        <w:rPr>
+          <w:sz w:val="36"/>
+          <w:szCs w:val="36"/>
+        </w:rPr>
+        <w:t xml:space="preserve"> Always call </w:t>
+      </w:r>
+      <w:r>
+        <w:rPr>
+          <w:b/>
+          <w:bCs/>
+          <w:sz w:val="36"/>
+          <w:szCs w:val="36"/>
+        </w:rPr>
+        <w:t xml:space="preserve">super.dispose() </w:t>
+      </w:r>
+      <w:r>
+        <w:rPr>
+          <w:sz w:val="36"/>
+          <w:szCs w:val="36"/>
+        </w:rPr>
+        <w:t>last.</w:t>
+      </w:r>
+      <w:r>
+        <w:rPr>
           <w:sz w:val="36"/>
           <w:szCs w:val="36"/>
         </w:rPr>
@@ -4028,664 +4816,263 @@
       </w:r>
       <w:r>
         <w:rPr>
-          <w:sz w:val="36"/>
-          <w:szCs w:val="36"/>
-        </w:rPr>
-        <w:t>(Rarely Used)</w:t>
-      </w:r>
-      <w:r>
-        <w:rPr>
-          <w:b/>
-          <w:bCs/>
-          <w:sz w:val="36"/>
-          <w:szCs w:val="36"/>
-        </w:rPr>
-        <w:t>:</w:t>
-      </w:r>
-    </w:p>
-    <w:p>
-      <w:pPr>
-        <w:jc w:val="both"/>
-        <w:rPr>
-          <w:sz w:val="36"/>
-          <w:szCs w:val="36"/>
-        </w:rPr>
-      </w:pPr>
-      <w:r>
-        <w:rPr>
+          <w:b/>
+          <w:bCs/>
+          <w:sz w:val="36"/>
+          <w:szCs w:val="36"/>
+        </w:rPr>
+        <w:t>super</w:t>
+      </w:r>
+      <w:r>
+        <w:rPr>
+          <w:sz w:val="36"/>
+          <w:szCs w:val="36"/>
+        </w:rPr>
+        <w:t xml:space="preserve"> keyword keeps the flutters internal dispose method intact adding</w:t>
+      </w:r>
+      <w:r>
+        <w:rPr>
+          <w:sz w:val="36"/>
+          <w:szCs w:val="36"/>
+        </w:rPr>
+        <w:t xml:space="preserve"> </w:t>
+      </w:r>
+      <w:r>
+        <w:rPr>
+          <w:sz w:val="36"/>
+          <w:szCs w:val="36"/>
+        </w:rPr>
+        <w:t>our custom method too</w:t>
+      </w:r>
+      <w:r>
+        <w:rPr>
+          <w:sz w:val="36"/>
+          <w:szCs w:val="36"/>
+        </w:rPr>
+        <w:t>.</w:t>
+      </w:r>
+      <w:r>
+        <w:rPr>
+          <w:sz w:val="36"/>
+          <w:szCs w:val="36"/>
+        </w:rPr>
+        <w:t xml:space="preserve"> </w:t>
+      </w:r>
+    </w:p>
+    <w:p>
+      <w:pPr>
+        <w:jc w:val="both"/>
+        <w:rPr>
+          <w:sz w:val="36"/>
+          <w:szCs w:val="36"/>
+        </w:rPr>
+      </w:pPr>
+      <w:r>
+        <w:rPr>
+          <w:sz w:val="36"/>
+          <w:szCs w:val="36"/>
+        </w:rPr>
+        <w:t xml:space="preserve"># And don’t use </w:t>
+      </w:r>
+      <w:r>
+        <w:rPr>
+          <w:b/>
+          <w:bCs/>
+          <w:sz w:val="36"/>
+          <w:szCs w:val="36"/>
+        </w:rPr>
+        <w:t>context</w:t>
+      </w:r>
+      <w:r>
+        <w:rPr>
+          <w:sz w:val="36"/>
+          <w:szCs w:val="36"/>
+        </w:rPr>
+        <w:t xml:space="preserve"> in </w:t>
+      </w:r>
+      <w:r>
+        <w:rPr>
+          <w:b/>
+          <w:bCs/>
+          <w:sz w:val="36"/>
+          <w:szCs w:val="36"/>
+        </w:rPr>
+        <w:t>dispose()</w:t>
+      </w:r>
+      <w:r>
+        <w:rPr>
+          <w:sz w:val="36"/>
+          <w:szCs w:val="36"/>
+        </w:rPr>
+        <w:t xml:space="preserve"> method. Because while disposing the screen context might not be available and will throw error.</w:t>
+      </w:r>
+    </w:p>
+    <w:p>
+      <w:pPr>
+        <w:jc w:val="both"/>
+        <w:rPr>
+          <w:sz w:val="36"/>
+          <w:szCs w:val="36"/>
+        </w:rPr>
+      </w:pPr>
+    </w:p>
+    <w:p>
+      <w:pPr>
+        <w:jc w:val="both"/>
+        <w:rPr>
+          <w:sz w:val="36"/>
+          <w:szCs w:val="36"/>
+        </w:rPr>
+      </w:pPr>
+      <w:r>
+        <w:rPr>
+          <w:sz w:val="36"/>
+          <w:szCs w:val="36"/>
+        </w:rPr>
+        <w:t>Disposing local controllers inside a function:</w:t>
+      </w:r>
+    </w:p>
+    <w:p>
+      <w:pPr>
+        <w:jc w:val="both"/>
+        <w:rPr>
+          <w:sz w:val="36"/>
+          <w:szCs w:val="36"/>
+        </w:rPr>
+      </w:pPr>
+      <w:r>
+        <w:rPr>
+          <w:sz w:val="36"/>
+          <w:szCs w:val="36"/>
+        </w:rPr>
+        <w:t># Flutter automatically garbage collects this controller so it’s a short-lived dialog controller. We don’t need to manually dispose this using .then() or something.</w:t>
+      </w:r>
+    </w:p>
+    <w:p>
+      <w:pPr>
+        <w:jc w:val="both"/>
+        <w:rPr>
+          <w:b/>
+          <w:bCs/>
+          <w:color w:val="D86DCB" w:themeColor="accent5" w:themeTint="99"/>
+          <w:sz w:val="36"/>
+          <w:szCs w:val="36"/>
+        </w:rPr>
+      </w:pPr>
+      <w:r>
+        <w:rPr>
+          <w:b/>
+          <w:bCs/>
+          <w:color w:val="D86DCB" w:themeColor="accent5" w:themeTint="99"/>
+          <w:sz w:val="36"/>
+          <w:szCs w:val="36"/>
+        </w:rPr>
+        <w:t>void function () {</w:t>
+      </w:r>
+    </w:p>
+    <w:p>
+      <w:pPr>
+        <w:jc w:val="both"/>
+        <w:rPr>
+          <w:b/>
+          <w:bCs/>
+          <w:color w:val="D86DCB" w:themeColor="accent5" w:themeTint="99"/>
+          <w:sz w:val="36"/>
+          <w:szCs w:val="36"/>
+        </w:rPr>
+      </w:pPr>
+      <w:r>
+        <w:rPr>
+          <w:b/>
+          <w:bCs/>
+          <w:color w:val="D86DCB" w:themeColor="accent5" w:themeTint="99"/>
+          <w:sz w:val="36"/>
+          <w:szCs w:val="36"/>
+        </w:rPr>
+        <w:t>final controller = TextEditingController(text: tasks[index]);</w:t>
+      </w:r>
+    </w:p>
+    <w:p>
+      <w:pPr>
+        <w:jc w:val="both"/>
+        <w:rPr>
+          <w:b/>
+          <w:bCs/>
+          <w:color w:val="D86DCB" w:themeColor="accent5" w:themeTint="99"/>
+          <w:sz w:val="36"/>
+          <w:szCs w:val="36"/>
+        </w:rPr>
+      </w:pPr>
+      <w:r>
+        <w:rPr>
+          <w:b/>
+          <w:bCs/>
+          <w:color w:val="D86DCB" w:themeColor="accent5" w:themeTint="99"/>
+          <w:sz w:val="36"/>
+          <w:szCs w:val="36"/>
+        </w:rPr>
+        <w:t>showDialog(...);</w:t>
+      </w:r>
+    </w:p>
+    <w:p>
+      <w:pPr>
+        <w:jc w:val="both"/>
+        <w:rPr>
+          <w:b/>
+          <w:bCs/>
+          <w:color w:val="D86DCB" w:themeColor="accent5" w:themeTint="99"/>
+          <w:sz w:val="36"/>
+          <w:szCs w:val="36"/>
+        </w:rPr>
+      </w:pPr>
+      <w:r>
+        <w:rPr>
+          <w:b/>
+          <w:bCs/>
+          <w:color w:val="D86DCB" w:themeColor="accent5" w:themeTint="99"/>
+          <w:sz w:val="36"/>
+          <w:szCs w:val="36"/>
+        </w:rPr>
+        <w:t>}</w:t>
+      </w:r>
+    </w:p>
+    <w:p>
+      <w:pPr>
+        <w:jc w:val="both"/>
+        <w:rPr>
+          <w:sz w:val="36"/>
+          <w:szCs w:val="36"/>
+        </w:rPr>
+      </w:pPr>
+      <w:r>
+        <w:rPr>
+          <w:sz w:val="36"/>
+          <w:szCs w:val="36"/>
+        </w:rPr>
+        <w:t># Or we can declare the controller outside the function and then load the text into the controller and dispose in the lifecycle dispose method.</w:t>
+      </w:r>
+    </w:p>
+    <w:p>
+      <w:pPr>
+        <w:jc w:val="both"/>
+        <w:rPr>
+          <w:b/>
+          <w:bCs/>
+          <w:color w:val="D86DCB" w:themeColor="accent5" w:themeTint="99"/>
+          <w:sz w:val="36"/>
+          <w:szCs w:val="36"/>
+        </w:rPr>
+      </w:pPr>
+      <w:r>
+        <w:rPr>
+          <w:b/>
+          <w:bCs/>
+          <w:color w:val="D86DCB" w:themeColor="accent5" w:themeTint="99"/>
           <w:sz w:val="36"/>
           <w:szCs w:val="36"/>
         </w:rPr>
         <w:lastRenderedPageBreak/>
-        <w:t># It’s c</w:t>
-      </w:r>
-      <w:r>
-        <w:rPr>
-          <w:sz w:val="36"/>
-          <w:szCs w:val="36"/>
-        </w:rPr>
-        <w:t>alled when the widget is removed from the widget tree temporarily.</w:t>
-      </w:r>
-      <w:r>
-        <w:rPr>
-          <w:sz w:val="36"/>
-          <w:szCs w:val="36"/>
-        </w:rPr>
-        <w:t xml:space="preserve"> Like</w:t>
-      </w:r>
-      <w:r>
-        <w:rPr>
-          <w:sz w:val="36"/>
-          <w:szCs w:val="36"/>
-        </w:rPr>
-        <w:t xml:space="preserve"> </w:t>
-      </w:r>
-      <w:r>
-        <w:rPr>
-          <w:sz w:val="36"/>
-          <w:szCs w:val="36"/>
-        </w:rPr>
-        <w:t>n</w:t>
-      </w:r>
-      <w:r>
-        <w:rPr>
-          <w:sz w:val="36"/>
-          <w:szCs w:val="36"/>
-        </w:rPr>
-        <w:t>avigating to another page but might come back.</w:t>
-      </w:r>
-    </w:p>
-    <w:p>
-      <w:pPr>
-        <w:jc w:val="both"/>
-        <w:rPr>
-          <w:b/>
-          <w:bCs/>
-          <w:color w:val="D86DCB" w:themeColor="accent5" w:themeTint="99"/>
-          <w:sz w:val="36"/>
-          <w:szCs w:val="36"/>
-        </w:rPr>
-      </w:pPr>
-      <w:r>
-        <w:rPr>
-          <w:b/>
-          <w:bCs/>
-          <w:color w:val="D86DCB" w:themeColor="accent5" w:themeTint="99"/>
-          <w:sz w:val="36"/>
-          <w:szCs w:val="36"/>
-        </w:rPr>
-        <w:t>@override</w:t>
-      </w:r>
-    </w:p>
-    <w:p>
-      <w:pPr>
-        <w:jc w:val="both"/>
-        <w:rPr>
-          <w:b/>
-          <w:bCs/>
-          <w:color w:val="D86DCB" w:themeColor="accent5" w:themeTint="99"/>
-          <w:sz w:val="36"/>
-          <w:szCs w:val="36"/>
-        </w:rPr>
-      </w:pPr>
-      <w:r>
-        <w:rPr>
-          <w:b/>
-          <w:bCs/>
-          <w:color w:val="D86DCB" w:themeColor="accent5" w:themeTint="99"/>
-          <w:sz w:val="36"/>
-          <w:szCs w:val="36"/>
-        </w:rPr>
-        <w:t>void deactivate() {</w:t>
-      </w:r>
-    </w:p>
-    <w:p>
-      <w:pPr>
-        <w:jc w:val="both"/>
-        <w:rPr>
-          <w:b/>
-          <w:bCs/>
-          <w:color w:val="D86DCB" w:themeColor="accent5" w:themeTint="99"/>
-          <w:sz w:val="36"/>
-          <w:szCs w:val="36"/>
-        </w:rPr>
-      </w:pPr>
-      <w:r>
-        <w:rPr>
-          <w:b/>
-          <w:bCs/>
-          <w:color w:val="D86DCB" w:themeColor="accent5" w:themeTint="99"/>
-          <w:sz w:val="36"/>
-          <w:szCs w:val="36"/>
-        </w:rPr>
-        <w:t xml:space="preserve">  super.deactivate();</w:t>
-      </w:r>
-    </w:p>
-    <w:p>
-      <w:pPr>
-        <w:jc w:val="both"/>
-        <w:rPr>
-          <w:b/>
-          <w:bCs/>
-          <w:color w:val="D86DCB" w:themeColor="accent5" w:themeTint="99"/>
-          <w:sz w:val="36"/>
-          <w:szCs w:val="36"/>
-        </w:rPr>
-      </w:pPr>
-      <w:r>
-        <w:rPr>
-          <w:b/>
-          <w:bCs/>
-          <w:color w:val="D86DCB" w:themeColor="accent5" w:themeTint="99"/>
-          <w:sz w:val="36"/>
-          <w:szCs w:val="36"/>
-        </w:rPr>
-        <w:t xml:space="preserve">  print('Widget temporarily removed');</w:t>
-      </w:r>
-    </w:p>
-    <w:p>
-      <w:pPr>
-        <w:jc w:val="both"/>
-        <w:rPr>
-          <w:b/>
-          <w:bCs/>
-          <w:color w:val="D86DCB" w:themeColor="accent5" w:themeTint="99"/>
-          <w:sz w:val="36"/>
-          <w:szCs w:val="36"/>
-        </w:rPr>
-      </w:pPr>
-      <w:r>
-        <w:rPr>
-          <w:b/>
-          <w:bCs/>
-          <w:color w:val="D86DCB" w:themeColor="accent5" w:themeTint="99"/>
-          <w:sz w:val="36"/>
-          <w:szCs w:val="36"/>
-        </w:rPr>
-        <w:t>}</w:t>
-      </w:r>
-    </w:p>
-    <w:p>
-      <w:pPr>
-        <w:jc w:val="both"/>
-        <w:rPr>
-          <w:sz w:val="36"/>
-          <w:szCs w:val="36"/>
-        </w:rPr>
-      </w:pPr>
-    </w:p>
-    <w:p>
-      <w:pPr>
-        <w:jc w:val="both"/>
-        <w:rPr>
-          <w:b/>
-          <w:bCs/>
-          <w:sz w:val="36"/>
-          <w:szCs w:val="36"/>
-        </w:rPr>
-      </w:pPr>
-      <w:r>
-        <w:rPr>
-          <w:b/>
-          <w:bCs/>
-          <w:sz w:val="36"/>
-          <w:szCs w:val="36"/>
-        </w:rPr>
-        <w:t>dispose()</w:t>
-      </w:r>
-      <w:r>
-        <w:rPr>
-          <w:b/>
-          <w:bCs/>
-          <w:sz w:val="36"/>
-          <w:szCs w:val="36"/>
-        </w:rPr>
-        <w:t>:</w:t>
-      </w:r>
-    </w:p>
-    <w:p>
-      <w:pPr>
-        <w:jc w:val="both"/>
-        <w:rPr>
-          <w:sz w:val="36"/>
-          <w:szCs w:val="36"/>
-        </w:rPr>
-      </w:pPr>
-      <w:r>
-        <w:rPr>
-          <w:sz w:val="36"/>
-          <w:szCs w:val="36"/>
-        </w:rPr>
-        <w:t># It’s c</w:t>
-      </w:r>
-      <w:r>
-        <w:rPr>
-          <w:sz w:val="36"/>
-          <w:szCs w:val="36"/>
-        </w:rPr>
-        <w:t>alled when the widget is permanently removed (destroyed).</w:t>
-      </w:r>
-      <w:r>
-        <w:rPr>
-          <w:sz w:val="36"/>
-          <w:szCs w:val="36"/>
-        </w:rPr>
-        <w:t xml:space="preserve"> </w:t>
-      </w:r>
-      <w:r>
-        <w:rPr>
-          <w:sz w:val="36"/>
-          <w:szCs w:val="36"/>
-        </w:rPr>
-        <w:t xml:space="preserve">Perfect for cleaning up resources </w:t>
-      </w:r>
-      <w:r>
-        <w:rPr>
-          <w:sz w:val="36"/>
-          <w:szCs w:val="36"/>
-        </w:rPr>
-        <w:t xml:space="preserve">like </w:t>
-      </w:r>
-      <w:r>
-        <w:rPr>
-          <w:b/>
-          <w:bCs/>
-          <w:sz w:val="36"/>
-          <w:szCs w:val="36"/>
-        </w:rPr>
-        <w:t>controllers</w:t>
-      </w:r>
-      <w:r>
-        <w:rPr>
-          <w:sz w:val="36"/>
-          <w:szCs w:val="36"/>
-        </w:rPr>
-        <w:t xml:space="preserve">, </w:t>
-      </w:r>
-      <w:r>
-        <w:rPr>
-          <w:b/>
-          <w:bCs/>
-          <w:sz w:val="36"/>
-          <w:szCs w:val="36"/>
-        </w:rPr>
-        <w:t>streams</w:t>
-      </w:r>
-      <w:r>
-        <w:rPr>
-          <w:sz w:val="36"/>
-          <w:szCs w:val="36"/>
-        </w:rPr>
-        <w:t xml:space="preserve">, </w:t>
-      </w:r>
-      <w:r>
-        <w:rPr>
-          <w:b/>
-          <w:bCs/>
-          <w:sz w:val="36"/>
-          <w:szCs w:val="36"/>
-        </w:rPr>
-        <w:t>focus nodes</w:t>
-      </w:r>
-      <w:r>
-        <w:rPr>
-          <w:sz w:val="36"/>
-          <w:szCs w:val="36"/>
-        </w:rPr>
-        <w:t>, etc.</w:t>
-      </w:r>
-      <w:r>
-        <w:rPr>
-          <w:sz w:val="36"/>
-          <w:szCs w:val="36"/>
-        </w:rPr>
-        <w:t xml:space="preserve"> </w:t>
-      </w:r>
-      <w:r>
-        <w:rPr>
-          <w:sz w:val="36"/>
-          <w:szCs w:val="36"/>
-        </w:rPr>
-        <w:t>It is used to clean up the controller when the widget is disposed. This is important to prevent memory leaks</w:t>
-      </w:r>
-      <w:r>
-        <w:rPr>
-          <w:sz w:val="36"/>
-          <w:szCs w:val="36"/>
-        </w:rPr>
-        <w:t>.</w:t>
-      </w:r>
-    </w:p>
-    <w:p>
-      <w:pPr>
-        <w:jc w:val="both"/>
-        <w:rPr>
-          <w:b/>
-          <w:bCs/>
-          <w:color w:val="D86DCB" w:themeColor="accent5" w:themeTint="99"/>
-          <w:sz w:val="36"/>
-          <w:szCs w:val="36"/>
-        </w:rPr>
-      </w:pPr>
-      <w:r>
-        <w:rPr>
-          <w:b/>
-          <w:bCs/>
-          <w:color w:val="D86DCB" w:themeColor="accent5" w:themeTint="99"/>
-          <w:sz w:val="36"/>
-          <w:szCs w:val="36"/>
-        </w:rPr>
-        <w:t>@override</w:t>
-      </w:r>
-    </w:p>
-    <w:p>
-      <w:pPr>
-        <w:jc w:val="both"/>
-        <w:rPr>
-          <w:b/>
-          <w:bCs/>
-          <w:color w:val="D86DCB" w:themeColor="accent5" w:themeTint="99"/>
-          <w:sz w:val="36"/>
-          <w:szCs w:val="36"/>
-        </w:rPr>
-      </w:pPr>
-      <w:r>
-        <w:rPr>
-          <w:b/>
-          <w:bCs/>
-          <w:color w:val="D86DCB" w:themeColor="accent5" w:themeTint="99"/>
-          <w:sz w:val="36"/>
-          <w:szCs w:val="36"/>
-        </w:rPr>
-        <w:t>void dispose() {</w:t>
-      </w:r>
-    </w:p>
-    <w:p>
-      <w:pPr>
-        <w:jc w:val="both"/>
-        <w:rPr>
-          <w:b/>
-          <w:bCs/>
-          <w:color w:val="D86DCB" w:themeColor="accent5" w:themeTint="99"/>
-          <w:sz w:val="36"/>
-          <w:szCs w:val="36"/>
-        </w:rPr>
-      </w:pPr>
-      <w:r>
-        <w:rPr>
-          <w:b/>
-          <w:bCs/>
-          <w:color w:val="D86DCB" w:themeColor="accent5" w:themeTint="99"/>
-          <w:sz w:val="36"/>
-          <w:szCs w:val="36"/>
-        </w:rPr>
-        <w:t xml:space="preserve">  myController.dispose(); // prevents memory leak</w:t>
-      </w:r>
-    </w:p>
-    <w:p>
-      <w:pPr>
-        <w:jc w:val="both"/>
-        <w:rPr>
-          <w:b/>
-          <w:bCs/>
-          <w:color w:val="D86DCB" w:themeColor="accent5" w:themeTint="99"/>
-          <w:sz w:val="36"/>
-          <w:szCs w:val="36"/>
-        </w:rPr>
-      </w:pPr>
-      <w:r>
-        <w:rPr>
-          <w:b/>
-          <w:bCs/>
-          <w:color w:val="D86DCB" w:themeColor="accent5" w:themeTint="99"/>
-          <w:sz w:val="36"/>
-          <w:szCs w:val="36"/>
-        </w:rPr>
-        <w:t xml:space="preserve">  myAnimationController.dispose();</w:t>
-      </w:r>
-    </w:p>
-    <w:p>
-      <w:pPr>
-        <w:jc w:val="both"/>
-        <w:rPr>
-          <w:b/>
-          <w:bCs/>
-          <w:color w:val="D86DCB" w:themeColor="accent5" w:themeTint="99"/>
-          <w:sz w:val="36"/>
-          <w:szCs w:val="36"/>
-        </w:rPr>
-      </w:pPr>
-      <w:r>
-        <w:rPr>
-          <w:b/>
-          <w:bCs/>
-          <w:color w:val="D86DCB" w:themeColor="accent5" w:themeTint="99"/>
-          <w:sz w:val="36"/>
-          <w:szCs w:val="36"/>
-        </w:rPr>
-        <w:t xml:space="preserve">  super.dispose();</w:t>
-      </w:r>
-    </w:p>
-    <w:p>
-      <w:pPr>
-        <w:jc w:val="both"/>
-        <w:rPr>
-          <w:b/>
-          <w:bCs/>
-          <w:color w:val="D86DCB" w:themeColor="accent5" w:themeTint="99"/>
-          <w:sz w:val="36"/>
-          <w:szCs w:val="36"/>
-        </w:rPr>
-      </w:pPr>
-      <w:r>
-        <w:rPr>
-          <w:b/>
-          <w:bCs/>
-          <w:color w:val="D86DCB" w:themeColor="accent5" w:themeTint="99"/>
-          <w:sz w:val="36"/>
-          <w:szCs w:val="36"/>
-        </w:rPr>
-        <w:t>}</w:t>
-      </w:r>
-    </w:p>
-    <w:p>
-      <w:pPr>
-        <w:jc w:val="both"/>
-        <w:rPr>
-          <w:sz w:val="36"/>
-          <w:szCs w:val="36"/>
-        </w:rPr>
-      </w:pPr>
-      <w:r>
-        <w:rPr>
-          <w:b/>
-          <w:bCs/>
-          <w:sz w:val="36"/>
-          <w:szCs w:val="36"/>
-        </w:rPr>
-        <w:lastRenderedPageBreak/>
-        <w:t>N</w:t>
-      </w:r>
-      <w:r>
-        <w:rPr>
-          <w:b/>
-          <w:bCs/>
-          <w:sz w:val="36"/>
-          <w:szCs w:val="36"/>
-        </w:rPr>
-        <w:t>OTE</w:t>
-      </w:r>
-      <w:r>
-        <w:rPr>
-          <w:b/>
-          <w:bCs/>
-          <w:sz w:val="36"/>
-          <w:szCs w:val="36"/>
-        </w:rPr>
-        <w:t>:</w:t>
-      </w:r>
-      <w:r>
-        <w:rPr>
-          <w:sz w:val="36"/>
-          <w:szCs w:val="36"/>
-        </w:rPr>
-        <w:t xml:space="preserve"> Always call </w:t>
-      </w:r>
-      <w:r>
-        <w:rPr>
-          <w:b/>
-          <w:bCs/>
-          <w:sz w:val="36"/>
-          <w:szCs w:val="36"/>
-        </w:rPr>
-        <w:t xml:space="preserve">super.dispose() </w:t>
-      </w:r>
-      <w:r>
-        <w:rPr>
-          <w:sz w:val="36"/>
-          <w:szCs w:val="36"/>
-        </w:rPr>
-        <w:t>last.</w:t>
-      </w:r>
-      <w:r>
-        <w:rPr>
-          <w:sz w:val="36"/>
-          <w:szCs w:val="36"/>
-        </w:rPr>
-        <w:t xml:space="preserve"> </w:t>
-      </w:r>
-      <w:r>
-        <w:rPr>
-          <w:b/>
-          <w:bCs/>
-          <w:sz w:val="36"/>
-          <w:szCs w:val="36"/>
-        </w:rPr>
-        <w:t>super</w:t>
-      </w:r>
-      <w:r>
-        <w:rPr>
-          <w:sz w:val="36"/>
-          <w:szCs w:val="36"/>
-        </w:rPr>
-        <w:t xml:space="preserve"> keyword keeps the flutters internal dispose method intact adding</w:t>
-      </w:r>
-      <w:r>
-        <w:rPr>
-          <w:sz w:val="36"/>
-          <w:szCs w:val="36"/>
-        </w:rPr>
-        <w:t xml:space="preserve"> </w:t>
-      </w:r>
-      <w:r>
-        <w:rPr>
-          <w:sz w:val="36"/>
-          <w:szCs w:val="36"/>
-        </w:rPr>
-        <w:t>our custom method too</w:t>
-      </w:r>
-      <w:r>
-        <w:rPr>
-          <w:sz w:val="36"/>
-          <w:szCs w:val="36"/>
-        </w:rPr>
-        <w:t>.</w:t>
-      </w:r>
-      <w:r>
-        <w:rPr>
-          <w:sz w:val="36"/>
-          <w:szCs w:val="36"/>
-        </w:rPr>
-        <w:t xml:space="preserve"> </w:t>
-      </w:r>
-    </w:p>
-    <w:p>
-      <w:pPr>
-        <w:jc w:val="both"/>
-        <w:rPr>
-          <w:sz w:val="36"/>
-          <w:szCs w:val="36"/>
-        </w:rPr>
-      </w:pPr>
-      <w:r>
-        <w:rPr>
-          <w:sz w:val="36"/>
-          <w:szCs w:val="36"/>
-        </w:rPr>
-        <w:t xml:space="preserve"># And don’t use </w:t>
-      </w:r>
-      <w:r>
-        <w:rPr>
-          <w:b/>
-          <w:bCs/>
-          <w:sz w:val="36"/>
-          <w:szCs w:val="36"/>
-        </w:rPr>
-        <w:t>context</w:t>
-      </w:r>
-      <w:r>
-        <w:rPr>
-          <w:sz w:val="36"/>
-          <w:szCs w:val="36"/>
-        </w:rPr>
-        <w:t xml:space="preserve"> in </w:t>
-      </w:r>
-      <w:r>
-        <w:rPr>
-          <w:b/>
-          <w:bCs/>
-          <w:sz w:val="36"/>
-          <w:szCs w:val="36"/>
-        </w:rPr>
-        <w:t>dispose()</w:t>
-      </w:r>
-      <w:r>
-        <w:rPr>
-          <w:sz w:val="36"/>
-          <w:szCs w:val="36"/>
-        </w:rPr>
-        <w:t xml:space="preserve"> method. Because while disposing the screen context might not be available and will throw error.</w:t>
-      </w:r>
-    </w:p>
-    <w:p>
-      <w:pPr>
-        <w:jc w:val="both"/>
-        <w:rPr>
-          <w:sz w:val="36"/>
-          <w:szCs w:val="36"/>
-        </w:rPr>
-      </w:pPr>
-    </w:p>
-    <w:p>
-      <w:pPr>
-        <w:jc w:val="both"/>
-        <w:rPr>
-          <w:sz w:val="36"/>
-          <w:szCs w:val="36"/>
-        </w:rPr>
-      </w:pPr>
-      <w:r>
-        <w:rPr>
-          <w:sz w:val="36"/>
-          <w:szCs w:val="36"/>
-        </w:rPr>
-        <w:t>Disposing local controllers inside a function:</w:t>
-      </w:r>
-    </w:p>
-    <w:p>
-      <w:pPr>
-        <w:jc w:val="both"/>
-        <w:rPr>
-          <w:sz w:val="36"/>
-          <w:szCs w:val="36"/>
-        </w:rPr>
-      </w:pPr>
-      <w:r>
-        <w:rPr>
-          <w:sz w:val="36"/>
-          <w:szCs w:val="36"/>
-        </w:rPr>
-        <w:t># Flutter automatically garbage collects this controller so it’s a short-lived dialog controller. We don’t need to manually dispose this using .then() or something.</w:t>
+        <w:t>TextEditingController controller = TextEditingController();</w:t>
       </w:r>
     </w:p>
     <w:p>
@@ -4729,28 +5116,6 @@
           <w:sz w:val="36"/>
           <w:szCs w:val="36"/>
         </w:rPr>
-        <w:t>final controller = TextEditingController(text: tasks[index]);</w:t>
-      </w:r>
-    </w:p>
-    <w:p>
-      <w:pPr>
-        <w:jc w:val="both"/>
-        <w:rPr>
-          <w:b/>
-          <w:bCs/>
-          <w:color w:val="D86DCB" w:themeColor="accent5" w:themeTint="99"/>
-          <w:sz w:val="36"/>
-          <w:szCs w:val="36"/>
-        </w:rPr>
-      </w:pPr>
-      <w:r>
-        <w:rPr>
-          <w:b/>
-          <w:bCs/>
-          <w:color w:val="D86DCB" w:themeColor="accent5" w:themeTint="99"/>
-          <w:sz w:val="36"/>
-          <w:szCs w:val="36"/>
-        </w:rPr>
         <w:t>showDialog(...);</w:t>
       </w:r>
     </w:p>
@@ -4773,111 +5138,6 @@
           <w:sz w:val="36"/>
           <w:szCs w:val="36"/>
         </w:rPr>
-        <w:t>}</w:t>
-      </w:r>
-    </w:p>
-    <w:p>
-      <w:pPr>
-        <w:jc w:val="both"/>
-        <w:rPr>
-          <w:sz w:val="36"/>
-          <w:szCs w:val="36"/>
-        </w:rPr>
-      </w:pPr>
-      <w:r>
-        <w:rPr>
-          <w:sz w:val="36"/>
-          <w:szCs w:val="36"/>
-        </w:rPr>
-        <w:t># Or we can declare the controller outside the function and then load the text into the controller and dispose in the lifecycle dispose method.</w:t>
-      </w:r>
-    </w:p>
-    <w:p>
-      <w:pPr>
-        <w:jc w:val="both"/>
-        <w:rPr>
-          <w:b/>
-          <w:bCs/>
-          <w:color w:val="D86DCB" w:themeColor="accent5" w:themeTint="99"/>
-          <w:sz w:val="36"/>
-          <w:szCs w:val="36"/>
-        </w:rPr>
-      </w:pPr>
-      <w:r>
-        <w:rPr>
-          <w:b/>
-          <w:bCs/>
-          <w:color w:val="D86DCB" w:themeColor="accent5" w:themeTint="99"/>
-          <w:sz w:val="36"/>
-          <w:szCs w:val="36"/>
-        </w:rPr>
-        <w:t>TextEditingController controller = TextEditingController();</w:t>
-      </w:r>
-    </w:p>
-    <w:p>
-      <w:pPr>
-        <w:jc w:val="both"/>
-        <w:rPr>
-          <w:b/>
-          <w:bCs/>
-          <w:color w:val="D86DCB" w:themeColor="accent5" w:themeTint="99"/>
-          <w:sz w:val="36"/>
-          <w:szCs w:val="36"/>
-        </w:rPr>
-      </w:pPr>
-      <w:r>
-        <w:rPr>
-          <w:b/>
-          <w:bCs/>
-          <w:color w:val="D86DCB" w:themeColor="accent5" w:themeTint="99"/>
-          <w:sz w:val="36"/>
-          <w:szCs w:val="36"/>
-        </w:rPr>
-        <w:t>void function () {</w:t>
-      </w:r>
-    </w:p>
-    <w:p>
-      <w:pPr>
-        <w:jc w:val="both"/>
-        <w:rPr>
-          <w:b/>
-          <w:bCs/>
-          <w:color w:val="D86DCB" w:themeColor="accent5" w:themeTint="99"/>
-          <w:sz w:val="36"/>
-          <w:szCs w:val="36"/>
-        </w:rPr>
-      </w:pPr>
-      <w:r>
-        <w:rPr>
-          <w:b/>
-          <w:bCs/>
-          <w:color w:val="D86DCB" w:themeColor="accent5" w:themeTint="99"/>
-          <w:sz w:val="36"/>
-          <w:szCs w:val="36"/>
-        </w:rPr>
-        <w:t>showDialog(...);</w:t>
-      </w:r>
-    </w:p>
-    <w:p>
-      <w:pPr>
-        <w:jc w:val="both"/>
-        <w:rPr>
-          <w:b/>
-          <w:bCs/>
-          <w:color w:val="D86DCB" w:themeColor="accent5" w:themeTint="99"/>
-          <w:sz w:val="36"/>
-          <w:szCs w:val="36"/>
-        </w:rPr>
-      </w:pPr>
-      <w:r>
-        <w:rPr>
-          <w:b/>
-          <w:bCs/>
-          <w:color w:val="D86DCB" w:themeColor="accent5" w:themeTint="99"/>
-          <w:sz w:val="36"/>
-          <w:szCs w:val="36"/>
-        </w:rPr>
-        <w:lastRenderedPageBreak/>
         <w:t>}</w:t>
       </w:r>
     </w:p>
@@ -5322,6 +5582,7 @@
                 <w:sz w:val="36"/>
                 <w:szCs w:val="36"/>
               </w:rPr>
+              <w:lastRenderedPageBreak/>
               <w:t>Rebuild with state changes</w:t>
             </w:r>
           </w:p>
@@ -5445,7 +5706,6 @@
           <w:sz w:val="36"/>
           <w:szCs w:val="36"/>
         </w:rPr>
-        <w:lastRenderedPageBreak/>
         <w:t>Common Mistakes:</w:t>
       </w:r>
     </w:p>
@@ -5908,7 +6168,15 @@
                 <w:sz w:val="36"/>
                 <w:szCs w:val="36"/>
               </w:rPr>
-              <w:t xml:space="preserve"> might not be available</w:t>
+              <w:t xml:space="preserve"> might not </w:t>
+            </w:r>
+            <w:r>
+              <w:rPr>
+                <w:sz w:val="36"/>
+                <w:szCs w:val="36"/>
+              </w:rPr>
+              <w:lastRenderedPageBreak/>
+              <w:t>be available</w:t>
             </w:r>
           </w:p>
         </w:tc>
@@ -5930,6 +6198,7 @@
                 <w:sz w:val="36"/>
                 <w:szCs w:val="36"/>
               </w:rPr>
+              <w:lastRenderedPageBreak/>
               <w:t>Use Provider classes instance to call method or do work</w:t>
             </w:r>
           </w:p>

</xml_diff>